<commit_message>
control-clientes / autenticacion inicio
</commit_message>
<xml_diff>
--- a/ANGULAR/Manual/Instructivo basico.docx
+++ b/ANGULAR/Manual/Instructivo basico.docx
@@ -1229,8 +1229,14 @@
       <w:pPr>
         <w:pStyle w:val="Prrafodelista"/>
         <w:ind w:firstLine="696"/>
-      </w:pPr>
-      <w:r>
+        <w:rPr>
+          <w:lang w:val="en-US"/>
+        </w:rPr>
+      </w:pPr>
+      <w:r>
+        <w:rPr>
+          <w:lang w:val="en-US"/>
+        </w:rPr>
         <w:t>}</w:t>
       </w:r>
     </w:p>
@@ -12765,22 +12771,8 @@
           <w:lang w:val="en-US" w:eastAsia="es-CO"/>
           <w14:ligatures w14:val="none"/>
         </w:rPr>
-        <w:t xml:space="preserve">{ </w:t>
-      </w:r>
-      <w:proofErr w:type="spellStart"/>
-      <w:r>
-        <w:rPr>
-          <w:rFonts w:ascii="Consolas" w:eastAsia="Times New Roman" w:hAnsi="Consolas" w:cs="Times New Roman"/>
-          <w:color w:val="C9D1D9"/>
-          <w:kern w:val="0"/>
-          <w:sz w:val="21"/>
-          <w:szCs w:val="21"/>
-          <w:lang w:val="en-US" w:eastAsia="es-CO"/>
-          <w14:ligatures w14:val="none"/>
-        </w:rPr>
-        <w:t>LoginService</w:t>
-      </w:r>
-      <w:proofErr w:type="spellEnd"/>
+        <w:t>{ LoginService</w:t>
+      </w:r>
       <w:proofErr w:type="gramEnd"/>
       <w:r>
         <w:rPr>
@@ -15772,13 +15764,7 @@
         <w:pStyle w:val="Prrafodelista"/>
       </w:pPr>
       <w:r>
-        <w:t>•</w:t>
-      </w:r>
-      <w:r>
-        <w:t xml:space="preserve"> </w:t>
-      </w:r>
-      <w:r>
-        <w:t xml:space="preserve">Escalabilidad: </w:t>
+        <w:t xml:space="preserve">• Escalabilidad: </w:t>
       </w:r>
       <w:proofErr w:type="spellStart"/>
       <w:r>
@@ -15794,27 +15780,15 @@
         <w:pStyle w:val="Prrafodelista"/>
       </w:pPr>
       <w:r>
-        <w:t>•</w:t>
-      </w:r>
-      <w:r>
-        <w:t xml:space="preserve"> </w:t>
-      </w:r>
-      <w:r>
-        <w:t>Sincronización en Tiempo Real: Los datos se sincronizan en tiempo real con todas las instancias de la aplicación conectada.</w:t>
-      </w:r>
-    </w:p>
-    <w:p>
-      <w:pPr>
-        <w:pStyle w:val="Prrafodelista"/>
-      </w:pPr>
-      <w:r>
-        <w:t>•</w:t>
-      </w:r>
-      <w:r>
-        <w:t xml:space="preserve"> </w:t>
-      </w:r>
-      <w:r>
-        <w:t xml:space="preserve">Seguridad: </w:t>
+        <w:t>• Sincronización en Tiempo Real: Los datos se sincronizan en tiempo real con todas las instancias de la aplicación conectada.</w:t>
+      </w:r>
+    </w:p>
+    <w:p>
+      <w:pPr>
+        <w:pStyle w:val="Prrafodelista"/>
+      </w:pPr>
+      <w:r>
+        <w:t xml:space="preserve">• Seguridad: </w:t>
       </w:r>
       <w:proofErr w:type="spellStart"/>
       <w:r>
@@ -15855,6 +15829,211 @@
         <w:t>CreacionBaseDatosFirestore</w:t>
       </w:r>
       <w:proofErr w:type="spellEnd"/>
+    </w:p>
+    <w:p/>
+    <w:p>
+      <w:pPr>
+        <w:pStyle w:val="Prrafodelista"/>
+        <w:numPr>
+          <w:ilvl w:val="0"/>
+          <w:numId w:val="1"/>
+        </w:numPr>
+      </w:pPr>
+      <w:r>
+        <w:t xml:space="preserve">Autenticación </w:t>
+      </w:r>
+    </w:p>
+    <w:p>
+      <w:pPr>
+        <w:pStyle w:val="Prrafodelista"/>
+      </w:pPr>
+      <w:r>
+        <w:t xml:space="preserve">Se debe agregar un tipo de autenticación de </w:t>
+      </w:r>
+      <w:proofErr w:type="spellStart"/>
+      <w:r>
+        <w:t>firestore</w:t>
+      </w:r>
+      <w:proofErr w:type="spellEnd"/>
+      <w:r>
+        <w:t xml:space="preserve"> y modificar la regla de acceso a la base de datos para que se relacione con dicha autenticación</w:t>
+      </w:r>
+    </w:p>
+    <w:p>
+      <w:pPr>
+        <w:pStyle w:val="Prrafodelista"/>
+      </w:pPr>
+    </w:p>
+    <w:p>
+      <w:pPr>
+        <w:pStyle w:val="Prrafodelista"/>
+        <w:rPr>
+          <w:lang w:val="en-US"/>
+        </w:rPr>
+      </w:pPr>
+      <w:r>
+        <w:rPr>
+          <w:lang w:val="en-US"/>
+        </w:rPr>
+        <w:t xml:space="preserve">service </w:t>
+      </w:r>
+      <w:proofErr w:type="gramStart"/>
+      <w:r>
+        <w:rPr>
+          <w:lang w:val="en-US"/>
+        </w:rPr>
+        <w:t>cloud.firestore</w:t>
+      </w:r>
+      <w:proofErr w:type="gramEnd"/>
+      <w:r>
+        <w:rPr>
+          <w:lang w:val="en-US"/>
+        </w:rPr>
+        <w:t xml:space="preserve"> {</w:t>
+      </w:r>
+    </w:p>
+    <w:p>
+      <w:pPr>
+        <w:pStyle w:val="Prrafodelista"/>
+        <w:ind w:firstLine="696"/>
+        <w:rPr>
+          <w:lang w:val="en-US"/>
+        </w:rPr>
+      </w:pPr>
+      <w:r>
+        <w:rPr>
+          <w:lang w:val="en-US"/>
+        </w:rPr>
+        <w:t>match /</w:t>
+      </w:r>
+      <w:proofErr w:type="gramStart"/>
+      <w:r>
+        <w:rPr>
+          <w:lang w:val="en-US"/>
+        </w:rPr>
+        <w:t>databases</w:t>
+      </w:r>
+      <w:proofErr w:type="gramEnd"/>
+      <w:r>
+        <w:rPr>
+          <w:lang w:val="en-US"/>
+        </w:rPr>
+        <w:t>/</w:t>
+      </w:r>
+      <w:proofErr w:type="gramStart"/>
+      <w:r>
+        <w:rPr>
+          <w:lang w:val="en-US"/>
+        </w:rPr>
+        <w:t>{database}</w:t>
+      </w:r>
+      <w:proofErr w:type="gramEnd"/>
+      <w:r>
+        <w:rPr>
+          <w:lang w:val="en-US"/>
+        </w:rPr>
+        <w:t>/</w:t>
+      </w:r>
+      <w:proofErr w:type="gramStart"/>
+      <w:r>
+        <w:rPr>
+          <w:lang w:val="en-US"/>
+        </w:rPr>
+        <w:t>documents {</w:t>
+      </w:r>
+      <w:proofErr w:type="gramEnd"/>
+    </w:p>
+    <w:p>
+      <w:pPr>
+        <w:pStyle w:val="Prrafodelista"/>
+        <w:ind w:firstLine="696"/>
+        <w:rPr>
+          <w:lang w:val="en-US"/>
+        </w:rPr>
+      </w:pPr>
+      <w:r>
+        <w:rPr>
+          <w:lang w:val="en-US"/>
+        </w:rPr>
+        <w:t>match /</w:t>
+      </w:r>
+      <w:proofErr w:type="gramStart"/>
+      <w:r>
+        <w:rPr>
+          <w:lang w:val="en-US"/>
+        </w:rPr>
+        <w:t>clientes/{</w:t>
+      </w:r>
+      <w:proofErr w:type="gramEnd"/>
+      <w:r>
+        <w:rPr>
+          <w:lang w:val="en-US"/>
+        </w:rPr>
+        <w:t>document=</w:t>
+      </w:r>
+      <w:proofErr w:type="gramStart"/>
+      <w:r>
+        <w:rPr>
+          <w:lang w:val="en-US"/>
+        </w:rPr>
+        <w:t>**} {</w:t>
+      </w:r>
+      <w:proofErr w:type="gramEnd"/>
+    </w:p>
+    <w:p>
+      <w:pPr>
+        <w:pStyle w:val="Prrafodelista"/>
+        <w:ind w:left="1428" w:firstLine="696"/>
+        <w:rPr>
+          <w:lang w:val="en-US"/>
+        </w:rPr>
+      </w:pPr>
+      <w:r>
+        <w:rPr>
+          <w:lang w:val="en-US"/>
+        </w:rPr>
+        <w:t xml:space="preserve">allow read, write: if </w:t>
+      </w:r>
+      <w:proofErr w:type="gramStart"/>
+      <w:r>
+        <w:rPr>
+          <w:lang w:val="en-US"/>
+        </w:rPr>
+        <w:t>request.auth !=</w:t>
+      </w:r>
+      <w:proofErr w:type="gramEnd"/>
+      <w:r>
+        <w:rPr>
+          <w:lang w:val="en-US"/>
+        </w:rPr>
+        <w:t xml:space="preserve"> null;</w:t>
+      </w:r>
+    </w:p>
+    <w:p>
+      <w:pPr>
+        <w:pStyle w:val="Prrafodelista"/>
+        <w:ind w:left="1428" w:firstLine="696"/>
+      </w:pPr>
+      <w:r>
+        <w:t>}</w:t>
+      </w:r>
+    </w:p>
+    <w:p>
+      <w:pPr>
+        <w:pStyle w:val="Prrafodelista"/>
+        <w:ind w:firstLine="696"/>
+      </w:pPr>
+      <w:r>
+        <w:t>}</w:t>
+      </w:r>
+    </w:p>
+    <w:p>
+      <w:pPr>
+        <w:pStyle w:val="Prrafodelista"/>
+      </w:pPr>
+      <w:r>
+        <w:t>}</w:t>
+      </w:r>
     </w:p>
     <w:sectPr>
       <w:pgSz w:w="12240" w:h="15840"/>

</xml_diff>

<commit_message>
control-clientes / autenticacion y despliege hosting
</commit_message>
<xml_diff>
--- a/ANGULAR/Manual/Instructivo basico.docx
+++ b/ANGULAR/Manual/Instructivo basico.docx
@@ -4,7 +4,7 @@
   <w:body>
     <w:p>
       <w:pPr>
-        <w:ind w:left="720" w:hanging="360"/>
+        <w:ind w:left="1416" w:hanging="1056"/>
       </w:pPr>
       <w:r>
         <w:t>Instalación</w:t>
@@ -15619,13 +15619,42 @@
           <w:bCs/>
         </w:rPr>
       </w:pPr>
-      <w:r>
-        <w:rPr>
-          <w:b/>
-          <w:bCs/>
-        </w:rPr>
-        <w:t>11-02-DeployProduccion</w:t>
-      </w:r>
+      <w:hyperlink r:id="rId6" w:history="1">
+        <w:r>
+          <w:rPr>
+            <w:rStyle w:val="Hipervnculo"/>
+            <w:b/>
+            <w:bCs/>
+          </w:rPr>
+          <w:t>11-02-</w:t>
+        </w:r>
+        <w:proofErr w:type="spellStart"/>
+        <w:r>
+          <w:rPr>
+            <w:rStyle w:val="Hipervnculo"/>
+            <w:b/>
+            <w:bCs/>
+          </w:rPr>
+          <w:t>DeployP</w:t>
+        </w:r>
+        <w:r>
+          <w:rPr>
+            <w:rStyle w:val="Hipervnculo"/>
+            <w:b/>
+            <w:bCs/>
+          </w:rPr>
+          <w:t>r</w:t>
+        </w:r>
+        <w:r>
+          <w:rPr>
+            <w:rStyle w:val="Hipervnculo"/>
+            <w:b/>
+            <w:bCs/>
+          </w:rPr>
+          <w:t>oduccion</w:t>
+        </w:r>
+        <w:proofErr w:type="spellEnd"/>
+      </w:hyperlink>
     </w:p>
     <w:p>
       <w:pPr>
@@ -15820,15 +15849,22 @@
           <w:numId w:val="2"/>
         </w:numPr>
       </w:pPr>
-      <w:r>
-        <w:lastRenderedPageBreak/>
-        <w:t>12-01-00-</w:t>
-      </w:r>
-      <w:proofErr w:type="spellStart"/>
-      <w:r>
-        <w:t>CreacionBaseDatosFirestore</w:t>
-      </w:r>
-      <w:proofErr w:type="spellEnd"/>
+      <w:hyperlink r:id="rId7" w:history="1">
+        <w:r>
+          <w:rPr>
+            <w:rStyle w:val="Hipervnculo"/>
+          </w:rPr>
+          <w:t>12-01-00-</w:t>
+        </w:r>
+        <w:proofErr w:type="spellStart"/>
+        <w:r>
+          <w:rPr>
+            <w:rStyle w:val="Hipervnculo"/>
+          </w:rPr>
+          <w:t>CreacionBaseDatosFirestore</w:t>
+        </w:r>
+        <w:proofErr w:type="spellEnd"/>
+      </w:hyperlink>
     </w:p>
     <w:p/>
     <w:p>
@@ -16954,6 +16990,7 @@
   <w:style w:type="character" w:default="1" w:styleId="Fuentedeprrafopredeter">
     <w:name w:val="Default Paragraph Font"/>
     <w:uiPriority w:val="1"/>
+    <w:semiHidden/>
     <w:unhideWhenUsed/>
   </w:style>
   <w:style w:type="table" w:default="1" w:styleId="Tablanormal">
@@ -17306,6 +17343,18 @@
       <w:lang w:val="en-US"/>
     </w:rPr>
   </w:style>
+  <w:style w:type="character" w:styleId="Hipervnculovisitado">
+    <w:name w:val="FollowedHyperlink"/>
+    <w:basedOn w:val="Fuentedeprrafopredeter"/>
+    <w:uiPriority w:val="99"/>
+    <w:semiHidden/>
+    <w:unhideWhenUsed/>
+    <w:rsid w:val="004E2C8B"/>
+    <w:rPr>
+      <w:color w:val="96607D" w:themeColor="followedHyperlink"/>
+      <w:u w:val="single"/>
+    </w:rPr>
+  </w:style>
 </w:styles>
 </file>
 

</xml_diff>